<commit_message>
COMP 421: update grading weights in syllabus to sum to 100%
Trim Code Review 1 & 2 from 10% to 7.5% each.

Co-Authored-By: Claude Opus 4.8 <noreply@anthropic.com>
</commit_message>
<xml_diff>
--- a/docs/421_f26/421_syllabus.docx
+++ b/docs/421_f26/421_syllabus.docx
@@ -799,7 +799,21 @@
             <w:rStyle w:val="Hyperlink"/>
             <w:rFonts w:asciiTheme="minorHAnsi" w:hAnsiTheme="minorHAnsi" w:cstheme="minorHAnsi"/>
           </w:rPr>
-          <w:t>Database Systems Concepts (7th edition)</w:t>
+          <w:t>Database Systems Concep</w:t>
+        </w:r>
+        <w:r>
+          <w:rPr>
+            <w:rStyle w:val="Hyperlink"/>
+            <w:rFonts w:asciiTheme="minorHAnsi" w:hAnsiTheme="minorHAnsi" w:cstheme="minorHAnsi"/>
+          </w:rPr>
+          <w:t>t</w:t>
+        </w:r>
+        <w:r>
+          <w:rPr>
+            <w:rStyle w:val="Hyperlink"/>
+            <w:rFonts w:asciiTheme="minorHAnsi" w:hAnsiTheme="minorHAnsi" w:cstheme="minorHAnsi"/>
+          </w:rPr>
+          <w:t>s (7th edition)</w:t>
         </w:r>
       </w:hyperlink>
       <w:r>
@@ -1438,7 +1452,13 @@
     <w:p/>
     <w:p>
       <w:r>
-        <w:t>There will be a midterm exam, a final exam, and four programming projects which are expected to work-intensive for the students.  If time allows, there may be a fifth programming project.</w:t>
+        <w:t xml:space="preserve">There will be a midterm exam, a final exam, and </w:t>
+      </w:r>
+      <w:r>
+        <w:t>five</w:t>
+      </w:r>
+      <w:r>
+        <w:t xml:space="preserve"> programming projects which are expected to work-intensive for the students.</w:t>
       </w:r>
     </w:p>
     <w:p/>
@@ -1624,10 +1644,10 @@
     <w:p/>
     <w:p>
       <w:r>
-        <w:t>Code Review 1: 1</w:t>
-      </w:r>
-      <w:r>
-        <w:t>0</w:t>
+        <w:t xml:space="preserve">Code Review 1: </w:t>
+      </w:r>
+      <w:r>
+        <w:t>7.5</w:t>
       </w:r>
       <w:r>
         <w:t>%</w:t>
@@ -1635,10 +1655,10 @@
     </w:p>
     <w:p>
       <w:r>
-        <w:t>Code Review 2: 1</w:t>
-      </w:r>
-      <w:r>
-        <w:t>0</w:t>
+        <w:t xml:space="preserve">Code Review 2: </w:t>
+      </w:r>
+      <w:r>
+        <w:t>7.5</w:t>
       </w:r>
       <w:r>
         <w:t>%</w:t>
@@ -1650,7 +1670,10 @@
         <w:t xml:space="preserve">Midterm exam: </w:t>
       </w:r>
       <w:r>
-        <w:t>15</w:t>
+        <w:t>1</w:t>
+      </w:r>
+      <w:r>
+        <w:t>5</w:t>
       </w:r>
       <w:r>
         <w:t>%</w:t>

</xml_diff>